<commit_message>
top sheet changes, differential signalling added, now moving to sourcetree gui
</commit_message>
<xml_diff>
--- a/Meeting_Minutes(TemporarilyHere)/Meeting Minutes 06.02.2025.docx
+++ b/Meeting_Minutes(TemporarilyHere)/Meeting Minutes 06.02.2025.docx
@@ -21,6 +21,9 @@
     </w:p>
     <w:p>
       <w:r>
+        <w:rPr>
+          <w:noProof/>
+        </w:rPr>
         <w:drawing>
           <wp:inline distT="0" distB="0" distL="0" distR="0" wp14:anchorId="035EE8BA" wp14:editId="4C815782">
             <wp:extent cx="2446232" cy="1760373"/>
@@ -82,6 +85,322 @@
         <w:t>Sequential or functional</w:t>
       </w:r>
     </w:p>
+    <w:p>
+      <w:pPr>
+        <w:pStyle w:val="ListParagraph"/>
+        <w:numPr>
+          <w:ilvl w:val="0"/>
+          <w:numId w:val="1"/>
+        </w:numPr>
+      </w:pPr>
+      <w:r>
+        <w:t xml:space="preserve">Differential Pair routing </w:t>
+      </w:r>
+    </w:p>
+    <w:p>
+      <w:pPr>
+        <w:pStyle w:val="ListParagraph"/>
+      </w:pPr>
+      <w:r>
+        <w:t>On the top sheet it did not work so I put it in the bottom sheet for the multi sheet current conditioning – is this okay?</w:t>
+      </w:r>
+    </w:p>
+    <w:p>
+      <w:pPr>
+        <w:pStyle w:val="ListParagraph"/>
+        <w:numPr>
+          <w:ilvl w:val="1"/>
+          <w:numId w:val="1"/>
+        </w:numPr>
+      </w:pPr>
+      <w:r>
+        <w:t>Does Altium recognize these are separate signals</w:t>
+      </w:r>
+    </w:p>
+    <w:p>
+      <w:pPr>
+        <w:pStyle w:val="ListParagraph"/>
+        <w:ind w:left="1440"/>
+      </w:pPr>
+    </w:p>
+    <w:p>
+      <w:pPr>
+        <w:pStyle w:val="ListParagraph"/>
+        <w:numPr>
+          <w:ilvl w:val="0"/>
+          <w:numId w:val="1"/>
+        </w:numPr>
+      </w:pPr>
+      <w:r>
+        <w:t>Midterm presentation scheduling</w:t>
+      </w:r>
+    </w:p>
+    <w:p/>
+    <w:p>
+      <w:r>
+        <w:t>Altium Hotkeys:</w:t>
+      </w:r>
+    </w:p>
+    <w:p>
+      <w:pPr>
+        <w:pStyle w:val="ListParagraph"/>
+        <w:numPr>
+          <w:ilvl w:val="0"/>
+          <w:numId w:val="1"/>
+        </w:numPr>
+      </w:pPr>
+      <w:r>
+        <w:t>C-C – Validate</w:t>
+      </w:r>
+    </w:p>
+    <w:p>
+      <w:pPr>
+        <w:pStyle w:val="ListParagraph"/>
+        <w:numPr>
+          <w:ilvl w:val="0"/>
+          <w:numId w:val="1"/>
+        </w:numPr>
+      </w:pPr>
+      <w:r>
+        <w:t>Messages – shows you all the errors</w:t>
+      </w:r>
+    </w:p>
+    <w:p>
+      <w:r>
+        <w:t>Meeting Minutes:</w:t>
+      </w:r>
+    </w:p>
+    <w:p>
+      <w:pPr>
+        <w:pStyle w:val="ListParagraph"/>
+        <w:numPr>
+          <w:ilvl w:val="0"/>
+          <w:numId w:val="1"/>
+        </w:numPr>
+      </w:pPr>
+      <w:r>
+        <w:t xml:space="preserve">Align the recievers/transmitters by </w:t>
+      </w:r>
+      <w:r>
+        <w:t>4,388</w:t>
+      </w:r>
+    </w:p>
+    <w:p>
+      <w:pPr>
+        <w:pStyle w:val="ListParagraph"/>
+        <w:numPr>
+          <w:ilvl w:val="0"/>
+          <w:numId w:val="1"/>
+        </w:numPr>
+        <w:rPr>
+          <w:lang w:val="de-DE"/>
+        </w:rPr>
+      </w:pPr>
+      <w:r>
+        <w:rPr>
+          <w:lang w:val="de-DE"/>
+        </w:rPr>
+        <w:t>T -&gt; M (reset error markers h</w:t>
+      </w:r>
+      <w:r>
+        <w:rPr>
+          <w:lang w:val="de-DE"/>
+        </w:rPr>
+        <w:t>ot key)</w:t>
+      </w:r>
+    </w:p>
+    <w:p>
+      <w:pPr>
+        <w:rPr>
+          <w:lang w:val="de-DE"/>
+        </w:rPr>
+      </w:pPr>
+    </w:p>
+    <w:p>
+      <w:pPr>
+        <w:rPr>
+          <w:lang w:val="de-DE"/>
+        </w:rPr>
+      </w:pPr>
+      <w:r>
+        <w:rPr>
+          <w:lang w:val="de-DE"/>
+        </w:rPr>
+        <w:t>Op-Amps:</w:t>
+      </w:r>
+    </w:p>
+    <w:p>
+      <w:pPr>
+        <w:pStyle w:val="ListParagraph"/>
+        <w:numPr>
+          <w:ilvl w:val="0"/>
+          <w:numId w:val="1"/>
+        </w:numPr>
+        <w:rPr>
+          <w:lang w:val="de-DE"/>
+        </w:rPr>
+      </w:pPr>
+      <w:r>
+        <w:rPr>
+          <w:lang w:val="de-DE"/>
+        </w:rPr>
+        <w:t>Add feedback caps</w:t>
+      </w:r>
+    </w:p>
+    <w:p>
+      <w:pPr>
+        <w:pStyle w:val="ListParagraph"/>
+        <w:numPr>
+          <w:ilvl w:val="0"/>
+          <w:numId w:val="1"/>
+        </w:numPr>
+        <w:rPr>
+          <w:lang w:val="de-DE"/>
+        </w:rPr>
+      </w:pPr>
+      <w:r>
+        <w:rPr>
+          <w:lang w:val="de-DE"/>
+        </w:rPr>
+        <w:t>Resistors on output signals</w:t>
+      </w:r>
+    </w:p>
+    <w:p>
+      <w:pPr>
+        <w:pStyle w:val="ListParagraph"/>
+        <w:numPr>
+          <w:ilvl w:val="1"/>
+          <w:numId w:val="1"/>
+        </w:numPr>
+      </w:pPr>
+      <w:r>
+        <w:t>Look at other project and c</w:t>
+      </w:r>
+      <w:r>
+        <w:t>an use the same cap and resistor values</w:t>
+      </w:r>
+    </w:p>
+    <w:p>
+      <w:pPr>
+        <w:pStyle w:val="ListParagraph"/>
+        <w:numPr>
+          <w:ilvl w:val="0"/>
+          <w:numId w:val="1"/>
+        </w:numPr>
+      </w:pPr>
+      <w:r>
+        <w:t>Intuitive layout – look at Eyke’s design/Kaan’s layout – ADC cards</w:t>
+      </w:r>
+      <w:r>
+        <w:t xml:space="preserve"> (for pcb layout)</w:t>
+      </w:r>
+    </w:p>
+    <w:p/>
+    <w:p>
+      <w:r>
+        <w:t>Bring ethernet connector to the top sheet</w:t>
+      </w:r>
+    </w:p>
+    <w:p>
+      <w:r>
+        <w:t xml:space="preserve">Change the package size of the resistor in the analog </w:t>
+      </w:r>
+      <w:r>
+        <w:t>signaling</w:t>
+      </w:r>
+    </w:p>
+    <w:p/>
+    <w:p/>
+    <w:p/>
+    <w:p>
+      <w:r>
+        <w:lastRenderedPageBreak/>
+        <w:t>To Dos:</w:t>
+      </w:r>
+    </w:p>
+    <w:p>
+      <w:pPr>
+        <w:pStyle w:val="ListParagraph"/>
+        <w:numPr>
+          <w:ilvl w:val="0"/>
+          <w:numId w:val="1"/>
+        </w:numPr>
+      </w:pPr>
+      <w:r>
+        <w:t>Move the Ethernet connector to top sheet</w:t>
+      </w:r>
+    </w:p>
+    <w:p>
+      <w:pPr>
+        <w:pStyle w:val="ListParagraph"/>
+        <w:numPr>
+          <w:ilvl w:val="0"/>
+          <w:numId w:val="1"/>
+        </w:numPr>
+      </w:pPr>
+      <w:r>
+        <w:t>Change the package size of the resistor for the analog signaling</w:t>
+      </w:r>
+    </w:p>
+    <w:p>
+      <w:pPr>
+        <w:pStyle w:val="ListParagraph"/>
+        <w:numPr>
+          <w:ilvl w:val="0"/>
+          <w:numId w:val="1"/>
+        </w:numPr>
+      </w:pPr>
+      <w:r>
+        <w:t>Add op amps and caps for feedback and output signals for the Fully Differential Op Amps</w:t>
+      </w:r>
+    </w:p>
+    <w:p>
+      <w:pPr>
+        <w:pStyle w:val="ListParagraph"/>
+      </w:pPr>
+    </w:p>
+    <w:p>
+      <w:pPr>
+        <w:pStyle w:val="ListParagraph"/>
+        <w:numPr>
+          <w:ilvl w:val="0"/>
+          <w:numId w:val="1"/>
+        </w:numPr>
+      </w:pPr>
+      <w:r>
+        <w:t>Change PCB layout</w:t>
+      </w:r>
+    </w:p>
+    <w:p>
+      <w:pPr>
+        <w:pStyle w:val="ListParagraph"/>
+      </w:pPr>
+    </w:p>
+    <w:p>
+      <w:pPr>
+        <w:pStyle w:val="ListParagraph"/>
+        <w:numPr>
+          <w:ilvl w:val="1"/>
+          <w:numId w:val="1"/>
+        </w:numPr>
+      </w:pPr>
+      <w:r>
+        <w:t>100nF capacitor placed the closest to the component</w:t>
+      </w:r>
+    </w:p>
+    <w:p>
+      <w:pPr>
+        <w:pStyle w:val="ListParagraph"/>
+        <w:numPr>
+          <w:ilvl w:val="1"/>
+          <w:numId w:val="1"/>
+        </w:numPr>
+      </w:pPr>
+      <w:r>
+        <w:t>Intuitive Differential OpAmp layout – see Eyke’s design</w:t>
+      </w:r>
+    </w:p>
+    <w:p/>
     <w:sectPr>
       <w:pgSz w:w="11906" w:h="16838"/>
       <w:pgMar w:top="1440" w:right="1440" w:bottom="1440" w:left="1440" w:header="708" w:footer="708" w:gutter="0"/>

</xml_diff>